<commit_message>
Solution Design template: scoped web-scale variant; DR template parity
The Solution Design template now has two scoped variants from one generator:
- base (unchanged shape) for most clusters;
- a web-scale variant (adds Web-scale Design + Microservice & Serverless Design sections)
  served to S1-CL2 states, where the design work scales a web app and adds a microservice.
The Templates page selects the right .docx per state; the on-page label is unchanged.

Also regenerates the DR Plan template (PC 2.5 / PC 4.1 prompts added for parity with the
rebuilt AT1 DR Plan exemplar).

Co-Authored-By: Claude Opus 4.8 <noreply@anthropic.com>
</commit_message>
<xml_diff>
--- a/public/templates/YAT-DR-Plan-Template.docx
+++ b/public/templates/YAT-DR-Plan-Template.docx
@@ -1494,6 +1494,33 @@
     </w:p>
     <w:p>
       <w:pPr>
+        <w:pStyle w:val="Heading3"/>
+      </w:pPr>
+      <w:r>
+        <w:t>4.5 Recording the analysis</w:t>
+      </w:r>
+    </w:p>
+    <w:p>
+      <w:r>
+        <w:rPr>
+          <w:i/>
+          <w:color w:val="6B6660"/>
+          <w:sz w:val="19"/>
+        </w:rPr>
+        <w:t>State where the outcomes of this impact analysis are recorded and under what organisational policy (e.g. records-management / documentation procedures), so the analysis is retained, auditable, and available to the recovery team.</w:t>
+      </w:r>
+    </w:p>
+    <w:p>
+      <w:r>
+        <w:rPr>
+          <w:i/>
+          <w:color w:val="6B6660"/>
+        </w:rPr>
+        <w:t>[ Write your response here ]</w:t>
+      </w:r>
+    </w:p>
+    <w:p>
+      <w:pPr>
         <w:pStyle w:val="Heading1"/>
       </w:pPr>
       <w:r>
@@ -2232,7 +2259,7 @@
           <w:color w:val="6B6660"/>
           <w:sz w:val="19"/>
         </w:rPr>
-        <w:t>Set out the steps of the recovery plan in order, with the owner and a target (cumulative) time for each, including key features and the service providers involved. The total must sit within your RTO. Complete the runbook below (add rows as needed).</w:t>
+        <w:t>Set out the steps of the recovery plan in order, with the owner and a target (cumulative) time for each, including key features and the service providers involved. The total must sit within your RTO. Make sure the steps visibly address the risks you prioritised in §4 — your highest-severity risk should be answered first. Complete the runbook below (add rows as needed).</w:t>
       </w:r>
     </w:p>
     <w:tbl>

</xml_diff>